<commit_message>
data(HR-02): repair pending-corpus rankability against the shipped rubric
Vary the repeated prioritization bullet's surface form and position across
the pending resumes, remove it outright from several, and thin a few
resumes' collaboration or operational-rigor evidence so the weighted
criteria spread scores instead of clustering. Bullet-level edits only:
no entry, heading, duration, id or metadata line moves. DOCX rebuilt only
for the resumes whose source changed.
</commit_message>
<xml_diff>
--- a/artifacts/HR-02/build/resume-ca-101.docx
+++ b/artifacts/HR-02/build/resume-ca-101.docx
@@ -116,7 +116,7 @@
         </w:numPr>
       </w:pPr>
       <w:r>
-        <w:t xml:space="preserve">Replaced an inherited retry procedure after writing down the two failure modes it had been conflating and what each one cost the customer waiting on it, then chose the option that paid for the one they actually felt.</w:t>
+        <w:t xml:space="preserve">Ruled two of the five regions out for the quarter, and left the reason for the wider group to read rather than raising it in a meeting.</w:t>
       </w:r>
     </w:p>
     <w:p>
@@ -128,7 +128,7 @@
         </w:numPr>
       </w:pPr>
       <w:r>
-        <w:t xml:space="preserve">Wrote the operating notes the two teams downstream now use to work out their own delays before raising anything with me.</w:t>
+        <w:t xml:space="preserve">Replaced an inherited retry procedure after writing down the two failure modes it had been conflating and what each one cost the customer waiting on it, then chose the option that paid for the one they actually felt.</w:t>
       </w:r>
     </w:p>
     <w:p>
@@ -140,7 +140,7 @@
         </w:numPr>
       </w:pPr>
       <w:r>
-        <w:t xml:space="preserve">Agreed a change window with a group who did not report to me by asking what the change would cost them rather than when they could take it.</w:t>
+        <w:t xml:space="preserve">Kept the two downstream teams informed about delays as they came up.</w:t>
       </w:r>
     </w:p>
     <w:p>
@@ -152,7 +152,7 @@
         </w:numPr>
       </w:pPr>
       <w:r>
-        <w:t xml:space="preserve">Said in the plan that two of the five regions would wait until the following quarter, and named who had agreed it.</w:t>
+        <w:t xml:space="preserve">Agreed a change window with a group who did not report to me by asking what the change would cost them rather than when they could take it.</w:t>
       </w:r>
     </w:p>
     <w:bookmarkEnd w:id="10"/>

</xml_diff>